<commit_message>
docs: finalize S2-MOM v1 manuscript and release audit
</commit_message>
<xml_diff>
--- a/docs/manuscript/s2_mom_v1/manuscript.docx
+++ b/docs/manuscript/s2_mom_v1/manuscript.docx
@@ -47,7 +47,7 @@
     <w:p>
       <w:r>
         <w:rPr/>
-        <w:t>In the primary sample (July 2012 to December 2021, 114 months), the shortcut pipeline overstates the gross winner-portfolio return by +0.5769% per month (Newey–West t = 3.959, one-sided p = 0.000038). The same comparison in the confirmation sample gives +1.2233% per month (t = 4.393). This result survives Holm and Benjamini–Hochberg adjustment and meets the frozen confirmation rule, but the test was executed after the main results were known and is reported as supplementary. In contrast, the pre-specified primary estimand, the change in the winner-minus-loser (WML) return between steps A and D, is −0.0587% per month in the primary sample (p = 0.7806) and +0.6750% in the confirmation sample (p = 0.0138), with opposite signs. It is inconclusive and, under the protocol's own criteria, not reliable. Corrected momentum is positive in the primary sample but concentrated in its second half. Several pre-registered robustness analyses were not executed; this is disclosed in full.</w:t>
+        <w:t>In the primary sample (July 2012 to December 2021, 114 months), the shortcut pipeline overstates the gross winner-portfolio return by +0.5769% per month (Newey–West t = 3.959, one-sided p = 0.000038). The same comparison in the confirmation sample gives +1.2233% per month (t = 4.393). This result survives Holm and Benjamini–Hochberg adjustment and meets the frozen confirmation rule, but the test was executed after the main results were known and is reported as supplementary. In contrast, the pre-specified primary estimand, the change in the winner-minus-loser (WML) return between steps A and D, is −0.0587% per month in the primary sample (p = 0.7806) and +0.6750% in the confirmation sample (p = 0.0138), with opposite signs, so the confirmation sample does not confirm it. It is inconclusive and, under the protocol's own criteria, not reliable; the primary test could detect only effects of about 0.59% per month. Corrected momentum is positive in the primary sample but concentrated in its second half. Several pre-registered robustness analyses were not executed; this is disclosed in full.</w:t>
       </w:r>
     </w:p>
     <w:p>
@@ -10739,11 +10739,11 @@
         <w:rPr>
           <w:b/>
         </w:rPr>
-        <w:t>Commands, in execution order.</w:t>
+        <w:t>Commands that produced the registered results, in execution order.</w:t>
       </w:r>
       <w:r>
         <w:rPr/>
-        <w:t xml:space="preserve"> Each runner refuses to overwrite an existing registered output, so reproduction requires a clean checkout with the result directories absent.</w:t>
+        <w:t xml:space="preserve"> Each runner ran once and refuses to overwrite a registered output, so these commands are the record of how the results were produced, not a way to reproduce them.</w:t>
       </w:r>
     </w:p>
     <w:p>
@@ -10778,11 +10778,38 @@
         <w:rPr>
           <w:b/>
         </w:rPr>
-        <w:t>Environment.</w:t>
+        <w:t>Verification.</w:t>
       </w:r>
       <w:r>
         <w:rPr/>
-        <w:t xml:space="preserve"> Python 3.13.5, pandas 2.2.3, NumPy 2.1.3, SciPy 1.15.3, on macOS (arm64), as recorded in the registry at the late-analysis run. Figures were drawn with Matplotlib 3.10.0. The bootstrap seed is 20261005.</w:t>
+        <w:t xml:space="preserve"> </w:t>
+      </w:r>
+      <w:r>
+        <w:rPr>
+          <w:rFonts w:ascii="Courier New" w:hAnsi="Courier New"/>
+          <w:sz w:val="16"/>
+        </w:rPr>
+        <w:t>python3 scripts/reproduce_s2_mom_v1.py</w:t>
+      </w:r>
+      <w:r>
+        <w:rPr/>
+        <w:t xml:space="preserve"> checks the environment, the protocol, the registry, the chain of input hashes and every registered file hash; it then recomputes the A–D ladder, δ, the Newey–West tests, the step E costs and the late-analysis statistics with code written separately from the experiment code, and compares them with the registered files (absolute tolerance 10</w:t>
+      </w:r>
+      <w:r>
+        <w:rPr/>
+        <w:t>−9</w:t>
+      </w:r>
+      <w:r>
+        <w:rPr/>
+        <w:t>, 10</w:t>
+      </w:r>
+      <w:r>
+        <w:rPr/>
+        <w:t>−12</w:t>
+      </w:r>
+      <w:r>
+        <w:rPr/>
+        <w:t xml:space="preserve"> for costs; counts, labels and portfolio membership must agree exactly). It registers nothing and writes nothing. The sensitivity treatments and the bootstrap resampling are checked by hash, not recomputed independently.</w:t>
       </w:r>
     </w:p>
     <w:p>
@@ -10790,7 +10817,30 @@
         <w:rPr>
           <w:b/>
         </w:rPr>
-        <w:t>Repository state.</w:t>
+        <w:t>Environment.</w:t>
+      </w:r>
+      <w:r>
+        <w:rPr/>
+        <w:t xml:space="preserve"> Python 3.13.5, pandas 2.2.3, NumPy 2.1.3, SciPy 1.15.3 and PyArrow 19.0.0 (Anaconda builds), on macOS (arm64). The environment is specified as a Conda environment with exact package builds (</w:t>
+      </w:r>
+      <w:r>
+        <w:rPr>
+          <w:rFonts w:ascii="Courier New" w:hAnsi="Courier New"/>
+          <w:sz w:val="16"/>
+        </w:rPr>
+        <w:t>release/s2_mom_v1/conda-osx-arm64.lock</w:t>
+      </w:r>
+      <w:r>
+        <w:rPr/>
+        <w:t>); installation with pip is not supported. Figures were drawn with Matplotlib 3.10.0. The bootstrap seed is 20261005.</w:t>
+      </w:r>
+    </w:p>
+    <w:p>
+      <w:r>
+        <w:rPr>
+          <w:b/>
+        </w:rPr>
+        <w:t>Repository state and release verification.</w:t>
       </w:r>
       <w:r>
         <w:rPr/>
@@ -10805,7 +10855,29 @@
       </w:r>
       <w:r>
         <w:rPr/>
-        <w:t>. The experiment code, the addenda, the cost schedule and the result files were committed, unchanged from the registered runs, in commit f5bfed8 (tag s2-mom-v1-release-1); the registry records the tree as dirty at every run because the runs were made before that commit. The hashes in Table A5 are unchanged.</w:t>
+        <w:t xml:space="preserve">. The experiment code, the addenda, the cost schedule and the result files were committed, unchanged from the registered runs, in commit </w:t>
+      </w:r>
+      <w:r>
+        <w:rPr>
+          <w:rFonts w:ascii="Courier New" w:hAnsi="Courier New"/>
+          <w:sz w:val="16"/>
+        </w:rPr>
+        <w:t>f5bfed8</w:t>
+      </w:r>
+      <w:r>
+        <w:rPr/>
+        <w:t xml:space="preserve">, tagged </w:t>
+      </w:r>
+      <w:r>
+        <w:rPr>
+          <w:rFonts w:ascii="Courier New" w:hAnsi="Courier New"/>
+          <w:sz w:val="16"/>
+        </w:rPr>
+        <w:t>s2-mom-v1-release-1</w:t>
+      </w:r>
+      <w:r>
+        <w:rPr/>
+        <w:t>; the registry records the tree as dirty at every run because the runs were made before that commit. The input files that are not in the repository (raw NSE files, Stage 2 datasets and the Stage 3 panel) are identified by a data archive whose SHA-256 is recorded in the registry. On 8 October 2026 a fresh clone of the tagged release, with these files restored from an external copy of the archive whose hash was verified and with the specified Conda environment rebuilt, reproduced every compared registered value within the stated tolerance. That verification ran on the machine that produced the results; reproduction on other hardware or operating systems has not been tested. The hashes in Table A5 are unchanged.</w:t>
       </w:r>
     </w:p>
     <w:p>
@@ -14826,6 +14898,66 @@
                 <w:sz w:val="15"/>
               </w:rPr>
               <w:t>ab28fd1750db3e222819013ef70ff69c4b48d5d5757d51ec5c77e9b6232253b3</w:t>
+            </w:r>
+          </w:p>
+        </w:tc>
+      </w:tr>
+      <w:tr>
+        <w:tc>
+          <w:tcPr>
+            <w:tcW w:type="dxa" w:w="4706"/>
+          </w:tcPr>
+          <w:p>
+            <w:r>
+              <w:rPr>
+                <w:rFonts w:ascii="Courier New" w:hAnsi="Courier New"/>
+                <w:sz w:val="15"/>
+              </w:rPr>
+              <w:t>docs/research/phase3a_momentum_protocol_addendum1_supplement2.md</w:t>
+            </w:r>
+          </w:p>
+        </w:tc>
+        <w:tc>
+          <w:tcPr>
+            <w:tcW w:type="dxa" w:w="4706"/>
+          </w:tcPr>
+          <w:p>
+            <w:r>
+              <w:rPr>
+                <w:rFonts w:ascii="Courier New" w:hAnsi="Courier New"/>
+                <w:sz w:val="15"/>
+              </w:rPr>
+              <w:t>6c373c5ff0db321cb753fff7a08db078ff29ca2c3f2f0cfbe8c0fb1431e6a888</w:t>
+            </w:r>
+          </w:p>
+        </w:tc>
+      </w:tr>
+      <w:tr>
+        <w:tc>
+          <w:tcPr>
+            <w:tcW w:type="dxa" w:w="4706"/>
+          </w:tcPr>
+          <w:p>
+            <w:r>
+              <w:rPr>
+                <w:rFonts w:ascii="Courier New" w:hAnsi="Courier New"/>
+                <w:sz w:val="15"/>
+              </w:rPr>
+              <w:t>docs/research/phase3a_momentum_protocol_addendum1_supplement3.md</w:t>
+            </w:r>
+          </w:p>
+        </w:tc>
+        <w:tc>
+          <w:tcPr>
+            <w:tcW w:type="dxa" w:w="4706"/>
+          </w:tcPr>
+          <w:p>
+            <w:r>
+              <w:rPr>
+                <w:rFonts w:ascii="Courier New" w:hAnsi="Courier New"/>
+                <w:sz w:val="15"/>
+              </w:rPr>
+              <w:t>682191de462bac3b5d2901995be8d20d355bb4d6146fd87a3f02ed8c6c2580ce</w:t>
             </w:r>
           </w:p>
         </w:tc>

</xml_diff>